<commit_message>
Fix footer page number font (was inheriting Eras Medium ITC)
The document's Normal style sets ascii/hAnsi font to "Eras Medium
ITC" (docDefaults/style "1"); the rest of the document overrides
this per-run with Times New Roman, but the footer's page-number
field never did, so it silently rendered in the wrong font. Added
an explicit Times New Roman rFonts override to every run in the
PAGE field in both footer1.xml and footer3.xml (the two footers
that actually contain the field; footer2.xml is the blank
first-page footer).

Verified: re-ran the docxtemplater render test against the updated
template - still zero leftover {...} tokens, rent table still 4
rows, and the font override survives into the rendered output.

Co-Authored-By: Claude Sonnet 5 <noreply@anthropic.com>
</commit_message>
<xml_diff>
--- a/templates/lease-agreement-template.docx
+++ b/templates/lease-agreement-template.docx
@@ -6756,18 +6756,33 @@
           <w:jc w:val="center"/>
         </w:pPr>
         <w:r>
+          <w:rPr>
+            <w:rFonts w:ascii="Times New Roman" w:hAnsi="Times New Roman" w:cs="Times New Roman"/>
+          </w:rPr>
           <w:fldChar w:fldCharType="begin"/>
         </w:r>
         <w:r>
+          <w:rPr>
+            <w:rFonts w:ascii="Times New Roman" w:hAnsi="Times New Roman" w:cs="Times New Roman"/>
+          </w:rPr>
           <w:instrText xml:space="preserve"> PAGE   \* MERGEFORMAT </w:instrText>
         </w:r>
         <w:r>
+          <w:rPr>
+            <w:rFonts w:ascii="Times New Roman" w:hAnsi="Times New Roman" w:cs="Times New Roman"/>
+          </w:rPr>
           <w:fldChar w:fldCharType="separate"/>
         </w:r>
         <w:r>
+          <w:rPr>
+            <w:rFonts w:ascii="Times New Roman" w:hAnsi="Times New Roman" w:cs="Times New Roman"/>
+          </w:rPr>
           <w:t>2</w:t>
         </w:r>
         <w:r>
+          <w:rPr>
+            <w:rFonts w:ascii="Times New Roman" w:hAnsi="Times New Roman" w:cs="Times New Roman"/>
+          </w:rPr>
           <w:fldChar w:fldCharType="end"/>
         </w:r>
       </w:p>
@@ -6810,18 +6825,33 @@
           <w:jc w:val="center"/>
         </w:pPr>
         <w:r>
+          <w:rPr>
+            <w:rFonts w:ascii="Times New Roman" w:hAnsi="Times New Roman" w:cs="Times New Roman"/>
+          </w:rPr>
           <w:fldChar w:fldCharType="begin"/>
         </w:r>
         <w:r>
+          <w:rPr>
+            <w:rFonts w:ascii="Times New Roman" w:hAnsi="Times New Roman" w:cs="Times New Roman"/>
+          </w:rPr>
           <w:instrText xml:space="preserve"> PAGE   \* MERGEFORMAT </w:instrText>
         </w:r>
         <w:r>
+          <w:rPr>
+            <w:rFonts w:ascii="Times New Roman" w:hAnsi="Times New Roman" w:cs="Times New Roman"/>
+          </w:rPr>
           <w:fldChar w:fldCharType="separate"/>
         </w:r>
         <w:r>
+          <w:rPr>
+            <w:rFonts w:ascii="Times New Roman" w:hAnsi="Times New Roman" w:cs="Times New Roman"/>
+          </w:rPr>
           <w:t>2</w:t>
         </w:r>
         <w:r>
+          <w:rPr>
+            <w:rFonts w:ascii="Times New Roman" w:hAnsi="Times New Roman" w:cs="Times New Roman"/>
+          </w:rPr>
           <w:fldChar w:fldCharType="end"/>
         </w:r>
       </w:p>

</xml_diff>

<commit_message>
Add tenant improvement details field to Document details
New optional free-text field on leases: what improvements the
landlord agreed to make for the tenant. Wired into the template's
Exhibit D ("Landlord's work") section, which previously held a
hardcoded 5-item bullet list specific to the original sample deal
(carpet tiles, kitchen build-out, etc.) - replaced that static list
with a single {tenantImprovementDetails} bullet so each generated
lease shows the actual agreed-upon work instead of someone else's.

Verified: docxtemplater render test with sample text (zero leftover
tokens, correct placement), then end-to-end locally against the real
database - saved the field on lease #2, confirmed it shows correctly
on both the document preview and the underlying data.

Co-Authored-By: Claude Sonnet 5 <noreply@anthropic.com>
</commit_message>
<xml_diff>
--- a/templates/lease-agreement-template.docx
+++ b/templates/lease-agreement-template.docx
@@ -5129,107 +5129,7 @@
           <w:sz w:val="24"/>
           <w:szCs w:val="24"/>
         </w:rPr>
-        <w:t>New carpet tiles located in the 5 private offices</w:t>
-      </w:r>
-    </w:p>
-    <w:p>
-      <w:pPr>
-        <w:pStyle w:val="34"/>
-        <w:numPr>
-          <w:ilvl w:val="0"/>
-          <w:numId w:val="5"/>
-        </w:numPr>
-        <w:jc w:val="left"/>
-        <w:rPr>
-          <w:rFonts w:ascii="Times New Roman" w:hAnsi="Times New Roman" w:cs="Times New Roman"/>
-          <w:color w:val="000000"/>
-          <w:sz w:val="24"/>
-          <w:szCs w:val="24"/>
-        </w:rPr>
-      </w:pPr>
-      <w:r>
-        <w:rPr>
-          <w:rFonts w:ascii="Times New Roman" w:hAnsi="Times New Roman" w:cs="Times New Roman"/>
-          <w:color w:val="000000"/>
-          <w:sz w:val="24"/>
-          <w:szCs w:val="24"/>
-        </w:rPr>
-        <w:t xml:space="preserve">Existing cabinets moved to the wall just inside the entrance door and adjacent to the first of the 5 private offices </w:t>
-      </w:r>
-    </w:p>
-    <w:p>
-      <w:pPr>
-        <w:pStyle w:val="34"/>
-        <w:numPr>
-          <w:ilvl w:val="0"/>
-          <w:numId w:val="5"/>
-        </w:numPr>
-        <w:jc w:val="left"/>
-        <w:rPr>
-          <w:rFonts w:ascii="Times New Roman" w:hAnsi="Times New Roman" w:cs="Times New Roman"/>
-          <w:color w:val="000000"/>
-          <w:sz w:val="24"/>
-          <w:szCs w:val="24"/>
-        </w:rPr>
-      </w:pPr>
-      <w:r>
-        <w:rPr>
-          <w:rFonts w:ascii="Times New Roman" w:hAnsi="Times New Roman" w:cs="Times New Roman"/>
-          <w:color w:val="000000"/>
-          <w:sz w:val="24"/>
-          <w:szCs w:val="24"/>
-        </w:rPr>
-        <w:t xml:space="preserve">Kitchen added with new kitchen counters, cabinets above and below the countertops, a sink, and an area for a full size refrigerator </w:t>
-      </w:r>
-    </w:p>
-    <w:p>
-      <w:pPr>
-        <w:pStyle w:val="34"/>
-        <w:numPr>
-          <w:ilvl w:val="0"/>
-          <w:numId w:val="5"/>
-        </w:numPr>
-        <w:jc w:val="left"/>
-        <w:rPr>
-          <w:rFonts w:ascii="Times New Roman" w:hAnsi="Times New Roman" w:cs="Times New Roman"/>
-          <w:color w:val="000000"/>
-          <w:sz w:val="24"/>
-          <w:szCs w:val="24"/>
-        </w:rPr>
-      </w:pPr>
-      <w:r>
-        <w:rPr>
-          <w:rFonts w:ascii="Times New Roman" w:hAnsi="Times New Roman" w:cs="Times New Roman"/>
-          <w:color w:val="000000"/>
-          <w:sz w:val="24"/>
-          <w:szCs w:val="24"/>
-        </w:rPr>
-        <w:t>Glass storefront for entrance of the space</w:t>
-      </w:r>
-    </w:p>
-    <w:p>
-      <w:pPr>
-        <w:pStyle w:val="34"/>
-        <w:numPr>
-          <w:ilvl w:val="0"/>
-          <w:numId w:val="5"/>
-        </w:numPr>
-        <w:jc w:val="left"/>
-        <w:rPr>
-          <w:rFonts w:ascii="Times New Roman" w:hAnsi="Times New Roman" w:cs="Times New Roman"/>
-          <w:color w:val="000000"/>
-          <w:sz w:val="24"/>
-          <w:szCs w:val="24"/>
-        </w:rPr>
-      </w:pPr>
-      <w:r>
-        <w:rPr>
-          <w:rFonts w:ascii="Times New Roman" w:hAnsi="Times New Roman" w:cs="Times New Roman"/>
-          <w:color w:val="000000"/>
-          <w:sz w:val="24"/>
-          <w:szCs w:val="24"/>
-        </w:rPr>
-        <w:t>Demising Walls added to as per design in Exhibit B</w:t>
+        <w:t>{tenantImprovementDetails}</w:t>
       </w:r>
     </w:p>
     <w:p>

</xml_diff>